<commit_message>
update run_demo to use Movie graph, add Node2Vec results
</commit_message>
<xml_diff>
--- a/林源卿2023312350安全通论实验报告2.docx
+++ b/林源卿2023312350安全通论实验报告2.docx
@@ -3349,7 +3349,6 @@
                   <w:insideH w:val="none" w:color="auto" w:sz="0" w:space="0"/>
                   <w:insideV w:val="none" w:color="auto" w:sz="0" w:space="0"/>
                 </w:tblBorders>
-                <w:shd w:val="clear" w:color="auto" w:fill="auto"/>
                 <w:tblCellMar>
                   <w:top w:w="0" w:type="dxa"/>
                   <w:left w:w="108" w:type="dxa"/>
@@ -3577,7 +3576,6 @@
                   <w:insideH w:val="none" w:color="auto" w:sz="0" w:space="0"/>
                   <w:insideV w:val="none" w:color="auto" w:sz="0" w:space="0"/>
                 </w:tblBorders>
-                <w:shd w:val="clear" w:color="auto" w:fill="auto"/>
                 <w:tblCellMar>
                   <w:top w:w="0" w:type="dxa"/>
                   <w:left w:w="108" w:type="dxa"/>
@@ -3679,7 +3677,6 @@
                   <w:insideH w:val="none" w:color="auto" w:sz="0" w:space="0"/>
                   <w:insideV w:val="none" w:color="auto" w:sz="0" w:space="0"/>
                 </w:tblBorders>
-                <w:shd w:val="clear" w:color="auto" w:fill="auto"/>
                 <w:tblCellMar>
                   <w:top w:w="0" w:type="dxa"/>
                   <w:left w:w="108" w:type="dxa"/>
@@ -3781,7 +3778,6 @@
                   <w:insideH w:val="none" w:color="auto" w:sz="0" w:space="0"/>
                   <w:insideV w:val="none" w:color="auto" w:sz="0" w:space="0"/>
                 </w:tblBorders>
-                <w:shd w:val="clear" w:color="auto" w:fill="auto"/>
                 <w:tblCellMar>
                   <w:top w:w="0" w:type="dxa"/>
                   <w:left w:w="108" w:type="dxa"/>
@@ -8633,28 +8629,6 @@
                 <w:rFonts w:hint="eastAsia"/>
               </w:rPr>
             </w:pPr>
-          </w:p>
-          <w:p>
-            <w:pPr>
-              <w:autoSpaceDE w:val="0"/>
-              <w:autoSpaceDN w:val="0"/>
-              <w:adjustRightInd w:val="0"/>
-              <w:jc w:val="left"/>
-              <w:rPr>
-                <w:rFonts w:hint="eastAsia"/>
-              </w:rPr>
-            </w:pPr>
-          </w:p>
-          <w:p>
-            <w:pPr>
-              <w:autoSpaceDE w:val="0"/>
-              <w:autoSpaceDN w:val="0"/>
-              <w:adjustRightInd w:val="0"/>
-              <w:jc w:val="left"/>
-              <w:rPr>
-                <w:rFonts w:hint="eastAsia"/>
-              </w:rPr>
-            </w:pPr>
             <w:r>
               <w:rPr>
                 <w:rFonts w:hint="eastAsia"/>
@@ -8704,98 +8678,614 @@
               <w:rPr>
                 <w:rFonts w:hint="eastAsia"/>
               </w:rPr>
-              <w:t>LPA算法将6个User节点划分为若干社区。预期结果：</w:t>
-            </w:r>
-          </w:p>
-          <w:p>
-            <w:pPr>
-              <w:autoSpaceDE w:val="0"/>
-              <w:autoSpaceDN w:val="0"/>
-              <w:adjustRightInd w:val="0"/>
-              <w:jc w:val="left"/>
-              <w:rPr>
-                <w:rFonts w:hint="eastAsia"/>
-              </w:rPr>
-            </w:pPr>
-          </w:p>
-          <w:p>
-            <w:pPr>
-              <w:autoSpaceDE w:val="0"/>
-              <w:autoSpaceDN w:val="0"/>
-              <w:adjustRightInd w:val="0"/>
-              <w:jc w:val="left"/>
-              <w:rPr>
-                <w:rFonts w:hint="eastAsia"/>
-              </w:rPr>
-            </w:pPr>
-            <w:r>
-              <w:rPr>
-                <w:rFonts w:hint="eastAsia"/>
-              </w:rPr>
-              <w:t>社区1：Alice, Bridget, Charles, Doug（通过Alice-Doug弱连接合并）</w:t>
-            </w:r>
-          </w:p>
-          <w:p>
-            <w:pPr>
-              <w:autoSpaceDE w:val="0"/>
-              <w:autoSpaceDN w:val="0"/>
-              <w:adjustRightInd w:val="0"/>
-              <w:jc w:val="left"/>
-              <w:rPr>
-                <w:rFonts w:hint="eastAsia"/>
-              </w:rPr>
-            </w:pPr>
-            <w:r>
-              <w:rPr>
-                <w:rFonts w:hint="eastAsia"/>
-              </w:rPr>
-              <w:t>社区2：Mark, Michael（双向紧密连接）</w:t>
-            </w:r>
-          </w:p>
-          <w:p>
-            <w:pPr>
-              <w:autoSpaceDE w:val="0"/>
-              <w:autoSpaceDN w:val="0"/>
-              <w:adjustRightInd w:val="0"/>
-              <w:jc w:val="left"/>
-              <w:rPr>
-                <w:rFonts w:hint="eastAsia"/>
-              </w:rPr>
-            </w:pPr>
-            <w:r>
-              <w:rPr>
-                <w:rFonts w:hint="eastAsia"/>
-              </w:rPr>
-              <w:t>截图11：User社交图数据创建完成后的图可视化</w:t>
-            </w:r>
-          </w:p>
-          <w:p>
-            <w:pPr>
-              <w:autoSpaceDE w:val="0"/>
-              <w:autoSpaceDN w:val="0"/>
-              <w:adjustRightInd w:val="0"/>
-              <w:jc w:val="left"/>
-              <w:rPr>
-                <w:rFonts w:hint="eastAsia"/>
-              </w:rPr>
-            </w:pPr>
-            <w:r>
-              <w:rPr>
-                <w:rFonts w:hint="eastAsia"/>
-              </w:rPr>
-              <w:t>截图12：LPA插件执行结果（显示社区划分）</w:t>
-            </w:r>
-          </w:p>
-          <w:p>
-            <w:pPr>
-              <w:autoSpaceDE w:val="0"/>
-              <w:autoSpaceDN w:val="0"/>
-              <w:adjustRightInd w:val="0"/>
-              <w:jc w:val="left"/>
-              <w:rPr>
-                <w:rFonts w:hint="eastAsia"/>
-              </w:rPr>
-            </w:pPr>
+              <w:t>LPA算法将6个User节点划分为若干社区。结果：</w:t>
+            </w:r>
+          </w:p>
+          <w:tbl>
+            <w:tblPr>
+              <w:tblStyle w:val="5"/>
+              <w:tblpPr w:leftFromText="180" w:rightFromText="180" w:vertAnchor="text" w:horzAnchor="page" w:tblpX="6" w:tblpY="294"/>
+              <w:tblOverlap w:val="never"/>
+              <w:tblW w:w="0" w:type="auto"/>
+              <w:tblInd w:w="0" w:type="dxa"/>
+              <w:tblBorders>
+                <w:top w:val="single" w:color="2A2B2C" w:sz="2" w:space="0"/>
+                <w:left w:val="single" w:color="2A2B2C" w:sz="2" w:space="0"/>
+                <w:bottom w:val="single" w:color="2A2B2C" w:sz="2" w:space="0"/>
+                <w:right w:val="single" w:color="2A2B2C" w:sz="2" w:space="0"/>
+                <w:insideH w:val="none" w:color="auto" w:sz="0" w:space="0"/>
+                <w:insideV w:val="none" w:color="auto" w:sz="0" w:space="0"/>
+              </w:tblBorders>
+              <w:shd w:val="clear" w:color="auto" w:fill="auto"/>
+              <w:tblLayout w:type="autofit"/>
+              <w:tblCellMar>
+                <w:top w:w="15" w:type="dxa"/>
+                <w:left w:w="15" w:type="dxa"/>
+                <w:bottom w:w="15" w:type="dxa"/>
+                <w:right w:w="15" w:type="dxa"/>
+              </w:tblCellMar>
+            </w:tblPr>
+            <w:tblGrid>
+              <w:gridCol w:w="590"/>
+              <w:gridCol w:w="3240"/>
+              <w:gridCol w:w="440"/>
+            </w:tblGrid>
+            <w:tr>
+              <w:tblPrEx>
+                <w:tblBorders>
+                  <w:top w:val="single" w:color="2A2B2C" w:sz="2" w:space="0"/>
+                  <w:left w:val="single" w:color="2A2B2C" w:sz="2" w:space="0"/>
+                  <w:bottom w:val="single" w:color="2A2B2C" w:sz="2" w:space="0"/>
+                  <w:right w:val="single" w:color="2A2B2C" w:sz="2" w:space="0"/>
+                  <w:insideH w:val="none" w:color="auto" w:sz="0" w:space="0"/>
+                  <w:insideV w:val="none" w:color="auto" w:sz="0" w:space="0"/>
+                </w:tblBorders>
+                <w:tblCellMar>
+                  <w:top w:w="15" w:type="dxa"/>
+                  <w:left w:w="15" w:type="dxa"/>
+                  <w:bottom w:w="15" w:type="dxa"/>
+                  <w:right w:w="15" w:type="dxa"/>
+                </w:tblCellMar>
+              </w:tblPrEx>
+              <w:trPr>
+                <w:tblHeader/>
+              </w:trPr>
+              <w:tc>
+                <w:tcPr>
+                  <w:tcW w:w="0" w:type="auto"/>
+                  <w:tcBorders>
+                    <w:top w:val="single" w:color="2A2B2C" w:sz="2" w:space="0"/>
+                    <w:left w:val="single" w:color="2A2B2C" w:sz="2" w:space="0"/>
+                    <w:bottom w:val="single" w:color="2A2B2C" w:sz="2" w:space="0"/>
+                    <w:right w:val="single" w:color="2A2B2C" w:sz="2" w:space="0"/>
+                  </w:tcBorders>
+                  <w:shd w:val="clear" w:color="auto" w:fill="auto"/>
+                  <w:tcMar>
+                    <w:top w:w="20" w:type="dxa"/>
+                    <w:left w:w="20" w:type="dxa"/>
+                    <w:bottom w:w="20" w:type="dxa"/>
+                    <w:right w:w="20" w:type="dxa"/>
+                  </w:tcMar>
+                  <w:vAlign w:val="center"/>
+                </w:tcPr>
+                <w:p>
+                  <w:pPr>
+                    <w:keepNext w:val="0"/>
+                    <w:keepLines w:val="0"/>
+                    <w:widowControl/>
+                    <w:suppressLineNumbers w:val="0"/>
+                    <w:jc w:val="left"/>
+                    <w:textAlignment w:val="center"/>
+                    <w:rPr>
+                      <w:rStyle w:val="20"/>
+                      <w:color w:val="auto"/>
+                      <w:lang w:val="en-US" w:eastAsia="zh-CN" w:bidi="ar"/>
+                    </w:rPr>
+                  </w:pPr>
+                  <w:r>
+                    <w:rPr>
+                      <w:rStyle w:val="20"/>
+                      <w:rFonts w:hint="default"/>
+                      <w:color w:val="auto"/>
+                      <w:lang w:val="en-US" w:eastAsia="zh-CN" w:bidi="ar"/>
+                    </w:rPr>
+                    <w:t>社区</w:t>
+                  </w:r>
+                </w:p>
+              </w:tc>
+              <w:tc>
+                <w:tcPr>
+                  <w:tcW w:w="0" w:type="auto"/>
+                  <w:tcBorders>
+                    <w:top w:val="single" w:color="2A2B2C" w:sz="2" w:space="0"/>
+                    <w:left w:val="single" w:color="2A2B2C" w:sz="2" w:space="0"/>
+                    <w:bottom w:val="single" w:color="2A2B2C" w:sz="2" w:space="0"/>
+                    <w:right w:val="single" w:color="2A2B2C" w:sz="2" w:space="0"/>
+                  </w:tcBorders>
+                  <w:shd w:val="clear" w:color="auto" w:fill="auto"/>
+                  <w:tcMar>
+                    <w:top w:w="20" w:type="dxa"/>
+                    <w:left w:w="20" w:type="dxa"/>
+                    <w:bottom w:w="20" w:type="dxa"/>
+                    <w:right w:w="20" w:type="dxa"/>
+                  </w:tcMar>
+                  <w:vAlign w:val="center"/>
+                </w:tcPr>
+                <w:p>
+                  <w:pPr>
+                    <w:keepNext w:val="0"/>
+                    <w:keepLines w:val="0"/>
+                    <w:widowControl/>
+                    <w:suppressLineNumbers w:val="0"/>
+                    <w:jc w:val="left"/>
+                    <w:textAlignment w:val="center"/>
+                    <w:rPr>
+                      <w:rStyle w:val="20"/>
+                      <w:rFonts w:hint="default"/>
+                      <w:color w:val="auto"/>
+                      <w:lang w:val="en-US" w:eastAsia="zh-CN" w:bidi="ar"/>
+                    </w:rPr>
+                  </w:pPr>
+                  <w:r>
+                    <w:rPr>
+                      <w:rStyle w:val="20"/>
+                      <w:rFonts w:hint="default"/>
+                      <w:color w:val="auto"/>
+                      <w:lang w:val="en-US" w:eastAsia="zh-CN" w:bidi="ar"/>
+                    </w:rPr>
+                    <w:t>成员（索引→人名）</w:t>
+                  </w:r>
+                </w:p>
+              </w:tc>
+              <w:tc>
+                <w:tcPr>
+                  <w:tcW w:w="0" w:type="auto"/>
+                  <w:tcBorders>
+                    <w:top w:val="single" w:color="2A2B2C" w:sz="2" w:space="0"/>
+                    <w:left w:val="single" w:color="2A2B2C" w:sz="2" w:space="0"/>
+                    <w:bottom w:val="single" w:color="2A2B2C" w:sz="2" w:space="0"/>
+                    <w:right w:val="single" w:color="2A2B2C" w:sz="2" w:space="0"/>
+                  </w:tcBorders>
+                  <w:shd w:val="clear" w:color="auto" w:fill="auto"/>
+                  <w:tcMar>
+                    <w:top w:w="20" w:type="dxa"/>
+                    <w:left w:w="20" w:type="dxa"/>
+                    <w:bottom w:w="20" w:type="dxa"/>
+                    <w:right w:w="20" w:type="dxa"/>
+                  </w:tcMar>
+                  <w:vAlign w:val="center"/>
+                </w:tcPr>
+                <w:p>
+                  <w:pPr>
+                    <w:keepNext w:val="0"/>
+                    <w:keepLines w:val="0"/>
+                    <w:widowControl/>
+                    <w:suppressLineNumbers w:val="0"/>
+                    <w:jc w:val="left"/>
+                    <w:textAlignment w:val="center"/>
+                    <w:rPr>
+                      <w:rStyle w:val="20"/>
+                      <w:rFonts w:hint="default"/>
+                      <w:color w:val="auto"/>
+                      <w:lang w:val="en-US" w:eastAsia="zh-CN" w:bidi="ar"/>
+                    </w:rPr>
+                  </w:pPr>
+                  <w:r>
+                    <w:rPr>
+                      <w:rStyle w:val="20"/>
+                      <w:rFonts w:hint="default"/>
+                      <w:color w:val="auto"/>
+                      <w:lang w:val="en-US" w:eastAsia="zh-CN" w:bidi="ar"/>
+                    </w:rPr>
+                    <w:t>规模</w:t>
+                  </w:r>
+                </w:p>
+              </w:tc>
+            </w:tr>
+            <w:tr>
+              <w:tblPrEx>
+                <w:tblBorders>
+                  <w:top w:val="single" w:color="2A2B2C" w:sz="2" w:space="0"/>
+                  <w:left w:val="single" w:color="2A2B2C" w:sz="2" w:space="0"/>
+                  <w:bottom w:val="single" w:color="2A2B2C" w:sz="2" w:space="0"/>
+                  <w:right w:val="single" w:color="2A2B2C" w:sz="2" w:space="0"/>
+                  <w:insideH w:val="none" w:color="auto" w:sz="0" w:space="0"/>
+                  <w:insideV w:val="none" w:color="auto" w:sz="0" w:space="0"/>
+                </w:tblBorders>
+                <w:shd w:val="clear" w:color="auto" w:fill="auto"/>
+                <w:tblCellMar>
+                  <w:top w:w="15" w:type="dxa"/>
+                  <w:left w:w="15" w:type="dxa"/>
+                  <w:bottom w:w="15" w:type="dxa"/>
+                  <w:right w:w="15" w:type="dxa"/>
+                </w:tblCellMar>
+              </w:tblPrEx>
+              <w:tc>
+                <w:tcPr>
+                  <w:tcW w:w="0" w:type="auto"/>
+                  <w:tcBorders>
+                    <w:top w:val="single" w:color="2A2B2C" w:sz="2" w:space="0"/>
+                    <w:left w:val="single" w:color="2A2B2C" w:sz="2" w:space="0"/>
+                    <w:bottom w:val="single" w:color="2A2B2C" w:sz="2" w:space="0"/>
+                    <w:right w:val="single" w:color="2A2B2C" w:sz="2" w:space="0"/>
+                  </w:tcBorders>
+                  <w:shd w:val="clear" w:color="auto" w:fill="auto"/>
+                  <w:tcMar>
+                    <w:top w:w="20" w:type="dxa"/>
+                    <w:left w:w="20" w:type="dxa"/>
+                    <w:bottom w:w="20" w:type="dxa"/>
+                    <w:right w:w="20" w:type="dxa"/>
+                  </w:tcMar>
+                  <w:vAlign w:val="center"/>
+                </w:tcPr>
+                <w:p>
+                  <w:pPr>
+                    <w:keepNext w:val="0"/>
+                    <w:keepLines w:val="0"/>
+                    <w:widowControl/>
+                    <w:suppressLineNumbers w:val="0"/>
+                    <w:jc w:val="left"/>
+                    <w:textAlignment w:val="center"/>
+                    <w:rPr>
+                      <w:rStyle w:val="20"/>
+                      <w:rFonts w:hint="default"/>
+                      <w:color w:val="auto"/>
+                      <w:lang w:val="en-US" w:eastAsia="zh-CN" w:bidi="ar"/>
+                    </w:rPr>
+                  </w:pPr>
+                  <w:r>
+                    <w:rPr>
+                      <w:rStyle w:val="20"/>
+                      <w:rFonts w:hint="default"/>
+                      <w:color w:val="auto"/>
+                      <w:lang w:val="en-US" w:eastAsia="zh-CN" w:bidi="ar"/>
+                    </w:rPr>
+                    <w:t>社区1</w:t>
+                  </w:r>
+                </w:p>
+              </w:tc>
+              <w:tc>
+                <w:tcPr>
+                  <w:tcW w:w="0" w:type="auto"/>
+                  <w:tcBorders>
+                    <w:top w:val="single" w:color="2A2B2C" w:sz="2" w:space="0"/>
+                    <w:left w:val="single" w:color="2A2B2C" w:sz="2" w:space="0"/>
+                    <w:bottom w:val="single" w:color="2A2B2C" w:sz="2" w:space="0"/>
+                    <w:right w:val="single" w:color="2A2B2C" w:sz="2" w:space="0"/>
+                  </w:tcBorders>
+                  <w:shd w:val="clear" w:color="auto" w:fill="auto"/>
+                  <w:tcMar>
+                    <w:top w:w="20" w:type="dxa"/>
+                    <w:left w:w="20" w:type="dxa"/>
+                    <w:bottom w:w="20" w:type="dxa"/>
+                    <w:right w:w="20" w:type="dxa"/>
+                  </w:tcMar>
+                  <w:vAlign w:val="center"/>
+                </w:tcPr>
+                <w:p>
+                  <w:pPr>
+                    <w:keepNext w:val="0"/>
+                    <w:keepLines w:val="0"/>
+                    <w:widowControl/>
+                    <w:suppressLineNumbers w:val="0"/>
+                    <w:jc w:val="left"/>
+                    <w:textAlignment w:val="center"/>
+                    <w:rPr>
+                      <w:rStyle w:val="20"/>
+                      <w:rFonts w:hint="default"/>
+                      <w:color w:val="auto"/>
+                      <w:lang w:val="en-US" w:eastAsia="zh-CN" w:bidi="ar"/>
+                    </w:rPr>
+                  </w:pPr>
+                  <w:r>
+                    <w:rPr>
+                      <w:rStyle w:val="20"/>
+                      <w:rFonts w:hint="default"/>
+                      <w:color w:val="auto"/>
+                      <w:lang w:val="en-US" w:eastAsia="zh-CN" w:bidi="ar"/>
+                    </w:rPr>
+                    <w:t>0→Alice, 1→Bridget, 2→Charles</w:t>
+                  </w:r>
+                </w:p>
+              </w:tc>
+              <w:tc>
+                <w:tcPr>
+                  <w:tcW w:w="0" w:type="auto"/>
+                  <w:tcBorders>
+                    <w:top w:val="single" w:color="2A2B2C" w:sz="2" w:space="0"/>
+                    <w:left w:val="single" w:color="2A2B2C" w:sz="2" w:space="0"/>
+                    <w:bottom w:val="single" w:color="2A2B2C" w:sz="2" w:space="0"/>
+                    <w:right w:val="single" w:color="2A2B2C" w:sz="2" w:space="0"/>
+                  </w:tcBorders>
+                  <w:shd w:val="clear" w:color="auto" w:fill="auto"/>
+                  <w:tcMar>
+                    <w:top w:w="20" w:type="dxa"/>
+                    <w:left w:w="20" w:type="dxa"/>
+                    <w:bottom w:w="20" w:type="dxa"/>
+                    <w:right w:w="20" w:type="dxa"/>
+                  </w:tcMar>
+                  <w:vAlign w:val="center"/>
+                </w:tcPr>
+                <w:p>
+                  <w:pPr>
+                    <w:keepNext w:val="0"/>
+                    <w:keepLines w:val="0"/>
+                    <w:widowControl/>
+                    <w:suppressLineNumbers w:val="0"/>
+                    <w:jc w:val="left"/>
+                    <w:textAlignment w:val="center"/>
+                    <w:rPr>
+                      <w:rStyle w:val="20"/>
+                      <w:rFonts w:hint="default"/>
+                      <w:color w:val="auto"/>
+                      <w:lang w:val="en-US" w:eastAsia="zh-CN" w:bidi="ar"/>
+                    </w:rPr>
+                  </w:pPr>
+                  <w:r>
+                    <w:rPr>
+                      <w:rStyle w:val="20"/>
+                      <w:rFonts w:hint="default"/>
+                      <w:color w:val="auto"/>
+                      <w:lang w:val="en-US" w:eastAsia="zh-CN" w:bidi="ar"/>
+                    </w:rPr>
+                    <w:t>3人</w:t>
+                  </w:r>
+                </w:p>
+              </w:tc>
+            </w:tr>
+            <w:tr>
+              <w:tblPrEx>
+                <w:tblBorders>
+                  <w:top w:val="single" w:color="2A2B2C" w:sz="2" w:space="0"/>
+                  <w:left w:val="single" w:color="2A2B2C" w:sz="2" w:space="0"/>
+                  <w:bottom w:val="single" w:color="2A2B2C" w:sz="2" w:space="0"/>
+                  <w:right w:val="single" w:color="2A2B2C" w:sz="2" w:space="0"/>
+                  <w:insideH w:val="none" w:color="auto" w:sz="0" w:space="0"/>
+                  <w:insideV w:val="none" w:color="auto" w:sz="0" w:space="0"/>
+                </w:tblBorders>
+                <w:shd w:val="clear" w:color="auto" w:fill="auto"/>
+                <w:tblCellMar>
+                  <w:top w:w="15" w:type="dxa"/>
+                  <w:left w:w="15" w:type="dxa"/>
+                  <w:bottom w:w="15" w:type="dxa"/>
+                  <w:right w:w="15" w:type="dxa"/>
+                </w:tblCellMar>
+              </w:tblPrEx>
+              <w:tc>
+                <w:tcPr>
+                  <w:tcW w:w="0" w:type="auto"/>
+                  <w:tcBorders>
+                    <w:top w:val="single" w:color="2A2B2C" w:sz="2" w:space="0"/>
+                    <w:left w:val="single" w:color="2A2B2C" w:sz="2" w:space="0"/>
+                    <w:bottom w:val="single" w:color="2A2B2C" w:sz="2" w:space="0"/>
+                    <w:right w:val="single" w:color="2A2B2C" w:sz="2" w:space="0"/>
+                  </w:tcBorders>
+                  <w:shd w:val="clear" w:color="auto" w:fill="auto"/>
+                  <w:tcMar>
+                    <w:top w:w="20" w:type="dxa"/>
+                    <w:left w:w="20" w:type="dxa"/>
+                    <w:bottom w:w="20" w:type="dxa"/>
+                    <w:right w:w="20" w:type="dxa"/>
+                  </w:tcMar>
+                  <w:vAlign w:val="center"/>
+                </w:tcPr>
+                <w:p>
+                  <w:pPr>
+                    <w:keepNext w:val="0"/>
+                    <w:keepLines w:val="0"/>
+                    <w:widowControl/>
+                    <w:suppressLineNumbers w:val="0"/>
+                    <w:jc w:val="left"/>
+                    <w:textAlignment w:val="center"/>
+                    <w:rPr>
+                      <w:rStyle w:val="20"/>
+                      <w:rFonts w:hint="default"/>
+                      <w:color w:val="auto"/>
+                      <w:lang w:val="en-US" w:eastAsia="zh-CN" w:bidi="ar"/>
+                    </w:rPr>
+                  </w:pPr>
+                  <w:r>
+                    <w:rPr>
+                      <w:rStyle w:val="20"/>
+                      <w:rFonts w:hint="default"/>
+                      <w:color w:val="auto"/>
+                      <w:lang w:val="en-US" w:eastAsia="zh-CN" w:bidi="ar"/>
+                    </w:rPr>
+                    <w:t>社区2</w:t>
+                  </w:r>
+                </w:p>
+              </w:tc>
+              <w:tc>
+                <w:tcPr>
+                  <w:tcW w:w="0" w:type="auto"/>
+                  <w:tcBorders>
+                    <w:top w:val="single" w:color="2A2B2C" w:sz="2" w:space="0"/>
+                    <w:left w:val="single" w:color="2A2B2C" w:sz="2" w:space="0"/>
+                    <w:bottom w:val="single" w:color="2A2B2C" w:sz="2" w:space="0"/>
+                    <w:right w:val="single" w:color="2A2B2C" w:sz="2" w:space="0"/>
+                  </w:tcBorders>
+                  <w:shd w:val="clear" w:color="auto" w:fill="auto"/>
+                  <w:tcMar>
+                    <w:top w:w="20" w:type="dxa"/>
+                    <w:left w:w="20" w:type="dxa"/>
+                    <w:bottom w:w="20" w:type="dxa"/>
+                    <w:right w:w="20" w:type="dxa"/>
+                  </w:tcMar>
+                  <w:vAlign w:val="center"/>
+                </w:tcPr>
+                <w:p>
+                  <w:pPr>
+                    <w:keepNext w:val="0"/>
+                    <w:keepLines w:val="0"/>
+                    <w:widowControl/>
+                    <w:suppressLineNumbers w:val="0"/>
+                    <w:jc w:val="left"/>
+                    <w:textAlignment w:val="center"/>
+                    <w:rPr>
+                      <w:rStyle w:val="20"/>
+                      <w:rFonts w:hint="default"/>
+                      <w:color w:val="auto"/>
+                      <w:lang w:val="en-US" w:eastAsia="zh-CN" w:bidi="ar"/>
+                    </w:rPr>
+                  </w:pPr>
+                  <w:r>
+                    <w:rPr>
+                      <w:rStyle w:val="20"/>
+                      <w:rFonts w:hint="default"/>
+                      <w:color w:val="auto"/>
+                      <w:lang w:val="en-US" w:eastAsia="zh-CN" w:bidi="ar"/>
+                    </w:rPr>
+                    <w:t>3→Doug, 4→Mark, 5→Michael</w:t>
+                  </w:r>
+                </w:p>
+              </w:tc>
+              <w:tc>
+                <w:tcPr>
+                  <w:tcW w:w="0" w:type="auto"/>
+                  <w:tcBorders>
+                    <w:top w:val="single" w:color="2A2B2C" w:sz="2" w:space="0"/>
+                    <w:left w:val="single" w:color="2A2B2C" w:sz="2" w:space="0"/>
+                    <w:bottom w:val="single" w:color="2A2B2C" w:sz="2" w:space="0"/>
+                    <w:right w:val="single" w:color="2A2B2C" w:sz="2" w:space="0"/>
+                  </w:tcBorders>
+                  <w:shd w:val="clear" w:color="auto" w:fill="auto"/>
+                  <w:tcMar>
+                    <w:top w:w="20" w:type="dxa"/>
+                    <w:left w:w="20" w:type="dxa"/>
+                    <w:bottom w:w="20" w:type="dxa"/>
+                    <w:right w:w="20" w:type="dxa"/>
+                  </w:tcMar>
+                  <w:vAlign w:val="center"/>
+                </w:tcPr>
+                <w:p>
+                  <w:pPr>
+                    <w:keepNext w:val="0"/>
+                    <w:keepLines w:val="0"/>
+                    <w:widowControl/>
+                    <w:suppressLineNumbers w:val="0"/>
+                    <w:jc w:val="left"/>
+                    <w:textAlignment w:val="center"/>
+                    <w:rPr>
+                      <w:rStyle w:val="20"/>
+                      <w:rFonts w:hint="default"/>
+                      <w:color w:val="auto"/>
+                      <w:lang w:val="en-US" w:eastAsia="zh-CN" w:bidi="ar"/>
+                    </w:rPr>
+                  </w:pPr>
+                  <w:r>
+                    <w:rPr>
+                      <w:rStyle w:val="20"/>
+                      <w:rFonts w:hint="default"/>
+                      <w:color w:val="auto"/>
+                      <w:lang w:val="en-US" w:eastAsia="zh-CN" w:bidi="ar"/>
+                    </w:rPr>
+                    <w:t>3人</w:t>
+                  </w:r>
+                </w:p>
+              </w:tc>
+            </w:tr>
+          </w:tbl>
+          <w:p>
+            <w:pPr>
+              <w:autoSpaceDE w:val="0"/>
+              <w:autoSpaceDN w:val="0"/>
+              <w:adjustRightInd w:val="0"/>
+              <w:jc w:val="left"/>
+              <w:rPr>
+                <w:rFonts w:hint="eastAsia"/>
+              </w:rPr>
+            </w:pPr>
+          </w:p>
+          <w:p>
+            <w:pPr>
+              <w:keepNext w:val="0"/>
+              <w:keepLines w:val="0"/>
+              <w:widowControl/>
+              <w:suppressLineNumbers w:val="0"/>
+              <w:jc w:val="left"/>
+            </w:pPr>
+          </w:p>
+          <w:p>
+            <w:pPr>
+              <w:autoSpaceDE w:val="0"/>
+              <w:autoSpaceDN w:val="0"/>
+              <w:adjustRightInd w:val="0"/>
+              <w:jc w:val="left"/>
+            </w:pPr>
+            <w:r>
+              <w:drawing>
+                <wp:inline distT="0" distB="0" distL="114300" distR="114300">
+                  <wp:extent cx="5125720" cy="3082290"/>
+                  <wp:effectExtent l="0" t="0" r="5080" b="3810"/>
+                  <wp:docPr id="20" name="图片 1"/>
+                  <wp:cNvGraphicFramePr>
+                    <a:graphicFrameLocks xmlns:a="http://schemas.openxmlformats.org/drawingml/2006/main" noChangeAspect="1"/>
+                  </wp:cNvGraphicFramePr>
+                  <a:graphic xmlns:a="http://schemas.openxmlformats.org/drawingml/2006/main">
+                    <a:graphicData uri="http://schemas.openxmlformats.org/drawingml/2006/picture">
+                      <pic:pic xmlns:pic="http://schemas.openxmlformats.org/drawingml/2006/picture">
+                        <pic:nvPicPr>
+                          <pic:cNvPr id="20" name="图片 1"/>
+                          <pic:cNvPicPr>
+                            <a:picLocks noChangeAspect="1"/>
+                          </pic:cNvPicPr>
+                        </pic:nvPicPr>
+                        <pic:blipFill>
+                          <a:blip r:embed="rId38"/>
+                          <a:stretch>
+                            <a:fillRect/>
+                          </a:stretch>
+                        </pic:blipFill>
+                        <pic:spPr>
+                          <a:xfrm>
+                            <a:off x="0" y="0"/>
+                            <a:ext cx="5125720" cy="3082290"/>
+                          </a:xfrm>
+                          <a:prstGeom prst="rect">
+                            <a:avLst/>
+                          </a:prstGeom>
+                          <a:noFill/>
+                          <a:ln>
+                            <a:noFill/>
+                          </a:ln>
+                        </pic:spPr>
+                      </pic:pic>
+                    </a:graphicData>
+                  </a:graphic>
+                </wp:inline>
+              </w:drawing>
+            </w:r>
+          </w:p>
+          <w:p>
+            <w:pPr>
+              <w:shd w:val="clear" w:fill="FFFF00"/>
+              <w:autoSpaceDE w:val="0"/>
+              <w:autoSpaceDN w:val="0"/>
+              <w:adjustRightInd w:val="0"/>
+              <w:jc w:val="left"/>
+              <w:rPr>
+                <w:rFonts w:hint="eastAsia"/>
+              </w:rPr>
+            </w:pPr>
+            <w:r>
+              <w:rPr>
+                <w:rFonts w:hint="eastAsia"/>
+              </w:rPr>
+              <w:t>Doug 同时连接两边：Alice（社区1，权重5）←→ Mark（社区2，权重1）。</w:t>
+            </w:r>
+          </w:p>
+          <w:p>
+            <w:pPr>
+              <w:shd w:val="clear" w:fill="FFFF00"/>
+              <w:autoSpaceDE w:val="0"/>
+              <w:autoSpaceDN w:val="0"/>
+              <w:adjustRightInd w:val="0"/>
+              <w:jc w:val="left"/>
+              <w:rPr>
+                <w:rFonts w:hint="eastAsia"/>
+              </w:rPr>
+            </w:pPr>
+            <w:r>
+              <w:rPr>
+                <w:rFonts w:hint="eastAsia"/>
+              </w:rPr>
+              <w:t>从权重看 Alice→Doug=5 远大于 Mark→Doug=1，按理 Doug 应该倾向于社区1，但实际划入了社区2。</w:t>
+            </w:r>
+          </w:p>
+          <w:p>
+            <w:pPr>
+              <w:shd w:val="clear" w:fill="FFFF00"/>
+              <w:autoSpaceDE w:val="0"/>
+              <w:autoSpaceDN w:val="0"/>
+              <w:adjustRightInd w:val="0"/>
+              <w:jc w:val="left"/>
+            </w:pPr>
+            <w:r>
+              <w:rPr>
+                <w:rFonts w:hint="eastAsia"/>
+              </w:rPr>
+              <w:t>这是因为 LPA 只看邻居标签频率，不看边权重（我们的实现没用到 weight 属性）。Doug 的邻居各有一个来自两边的标签，随机破平局时碰巧选了社区2。</w:t>
+            </w:r>
           </w:p>
           <w:p>
             <w:pPr>
@@ -8848,34 +9338,221 @@
                 <w:rFonts w:hint="eastAsia"/>
               </w:rPr>
             </w:pPr>
-          </w:p>
-          <w:p>
-            <w:pPr>
-              <w:autoSpaceDE w:val="0"/>
-              <w:autoSpaceDN w:val="0"/>
-              <w:adjustRightInd w:val="0"/>
-              <w:jc w:val="left"/>
-              <w:rPr>
-                <w:rFonts w:hint="eastAsia"/>
-              </w:rPr>
-            </w:pPr>
-            <w:r>
-              <w:rPr>
-                <w:rFonts w:hint="eastAsia"/>
-              </w:rPr>
-              <w:t>TuGraph 4.5.0版本目前不包含内置的K近邻相似度算法。PPT中已注明"TuGraph目前没有"。实验中记录此情况即可，如需实现可参考Neo4j图数据科学库的相似度算法文档。</w:t>
-            </w:r>
-          </w:p>
-          <w:p>
-            <w:pPr>
-              <w:autoSpaceDE w:val="0"/>
-              <w:autoSpaceDN w:val="0"/>
-              <w:adjustRightInd w:val="0"/>
-              <w:jc w:val="left"/>
-              <w:rPr>
-                <w:rFonts w:hint="eastAsia"/>
-              </w:rPr>
-            </w:pPr>
+            <w:r>
+              <w:rPr>
+                <w:rFonts w:hint="eastAsia"/>
+              </w:rPr>
+              <w:t>用 Cypher 直接实现 KNN 的图相似度计算——基于共同邻居的 Jaccard 相似度</w:t>
+            </w:r>
+          </w:p>
+          <w:p>
+            <w:pPr>
+              <w:autoSpaceDE w:val="0"/>
+              <w:autoSpaceDN w:val="0"/>
+              <w:adjustRightInd w:val="0"/>
+              <w:jc w:val="left"/>
+              <w:rPr>
+                <w:rFonts w:hint="eastAsia"/>
+              </w:rPr>
+            </w:pPr>
+            <w:r>
+              <w:rPr>
+                <w:rFonts w:hint="eastAsia"/>
+              </w:rPr>
+              <w:t>TuGraph 4.5.0版本目前不包含内置的K近邻相似度算法。PPT中已注明"TuGraph目前没有"。</w:t>
+            </w:r>
+          </w:p>
+          <w:p>
+            <w:pPr>
+              <w:autoSpaceDE w:val="0"/>
+              <w:autoSpaceDN w:val="0"/>
+              <w:adjustRightInd w:val="0"/>
+              <w:jc w:val="left"/>
+              <w:rPr>
+                <w:rFonts w:hint="eastAsia"/>
+              </w:rPr>
+            </w:pPr>
+            <w:r>
+              <w:rPr>
+                <w:rFonts w:hint="eastAsia"/>
+              </w:rPr>
+              <w:t xml:space="preserve"> TuGraph 兼容</w:t>
+            </w:r>
+            <w:r>
+              <w:rPr>
+                <w:rFonts w:hint="eastAsia"/>
+                <w:lang w:eastAsia="zh-CN"/>
+              </w:rPr>
+              <w:t>，</w:t>
+            </w:r>
+            <w:r>
+              <w:rPr>
+                <w:rFonts w:hint="eastAsia"/>
+              </w:rPr>
+              <w:t>用到 movie 模板数据，计算演员之间的相似度（共同参演电影越多越相似）：</w:t>
+            </w:r>
+          </w:p>
+          <w:p>
+            <w:pPr>
+              <w:shd w:val="clear" w:fill="E7E6E6" w:themeFill="background2"/>
+              <w:autoSpaceDE w:val="0"/>
+              <w:autoSpaceDN w:val="0"/>
+              <w:adjustRightInd w:val="0"/>
+              <w:jc w:val="left"/>
+              <w:rPr>
+                <w:rFonts w:hint="eastAsia"/>
+              </w:rPr>
+            </w:pPr>
+            <w:r>
+              <w:rPr>
+                <w:rFonts w:hint="eastAsia"/>
+              </w:rPr>
+              <w:t>MATCH (p1:person)-[:acted_in]-&gt;(m:movie)&lt;-[:acted_in]-(p2:person)</w:t>
+            </w:r>
+          </w:p>
+          <w:p>
+            <w:pPr>
+              <w:shd w:val="clear" w:fill="E7E6E6" w:themeFill="background2"/>
+              <w:autoSpaceDE w:val="0"/>
+              <w:autoSpaceDN w:val="0"/>
+              <w:adjustRightInd w:val="0"/>
+              <w:jc w:val="left"/>
+              <w:rPr>
+                <w:rFonts w:hint="eastAsia"/>
+              </w:rPr>
+            </w:pPr>
+            <w:r>
+              <w:rPr>
+                <w:rFonts w:hint="eastAsia"/>
+              </w:rPr>
+              <w:t>WHERE id(p1) &lt; id(p2)</w:t>
+            </w:r>
+          </w:p>
+          <w:p>
+            <w:pPr>
+              <w:shd w:val="clear" w:fill="E7E6E6" w:themeFill="background2"/>
+              <w:autoSpaceDE w:val="0"/>
+              <w:autoSpaceDN w:val="0"/>
+              <w:adjustRightInd w:val="0"/>
+              <w:jc w:val="left"/>
+              <w:rPr>
+                <w:rFonts w:hint="eastAsia"/>
+              </w:rPr>
+            </w:pPr>
+            <w:r>
+              <w:rPr>
+                <w:rFonts w:hint="eastAsia"/>
+              </w:rPr>
+              <w:t>RETURN p1.name AS person1, p2.name AS person2,</w:t>
+            </w:r>
+          </w:p>
+          <w:p>
+            <w:pPr>
+              <w:shd w:val="clear" w:fill="E7E6E6" w:themeFill="background2"/>
+              <w:autoSpaceDE w:val="0"/>
+              <w:autoSpaceDN w:val="0"/>
+              <w:adjustRightInd w:val="0"/>
+              <w:jc w:val="left"/>
+              <w:rPr>
+                <w:rFonts w:hint="eastAsia"/>
+              </w:rPr>
+            </w:pPr>
+            <w:r>
+              <w:rPr>
+                <w:rFonts w:hint="eastAsia"/>
+              </w:rPr>
+              <w:t xml:space="preserve">       COUNT(DISTINCT m) AS commonMovies</w:t>
+            </w:r>
+          </w:p>
+          <w:p>
+            <w:pPr>
+              <w:shd w:val="clear" w:fill="E7E6E6" w:themeFill="background2"/>
+              <w:autoSpaceDE w:val="0"/>
+              <w:autoSpaceDN w:val="0"/>
+              <w:adjustRightInd w:val="0"/>
+              <w:jc w:val="left"/>
+              <w:rPr>
+                <w:rFonts w:hint="eastAsia"/>
+              </w:rPr>
+            </w:pPr>
+            <w:r>
+              <w:rPr>
+                <w:rFonts w:hint="eastAsia"/>
+              </w:rPr>
+              <w:t>ORDER BY commonMovies DESC</w:t>
+            </w:r>
+          </w:p>
+          <w:p>
+            <w:pPr>
+              <w:shd w:val="clear" w:fill="E7E6E6" w:themeFill="background2"/>
+              <w:autoSpaceDE w:val="0"/>
+              <w:autoSpaceDN w:val="0"/>
+              <w:adjustRightInd w:val="0"/>
+              <w:jc w:val="left"/>
+              <w:rPr>
+                <w:rFonts w:hint="eastAsia"/>
+              </w:rPr>
+            </w:pPr>
+            <w:r>
+              <w:rPr>
+                <w:rFonts w:hint="eastAsia"/>
+              </w:rPr>
+              <w:t>LIMIT 10</w:t>
+            </w:r>
+          </w:p>
+          <w:p>
+            <w:pPr>
+              <w:autoSpaceDE w:val="0"/>
+              <w:autoSpaceDN w:val="0"/>
+              <w:adjustRightInd w:val="0"/>
+              <w:jc w:val="left"/>
+              <w:rPr>
+                <w:rFonts w:hint="eastAsia"/>
+              </w:rPr>
+            </w:pPr>
+            <w:r>
+              <w:drawing>
+                <wp:inline distT="0" distB="0" distL="114300" distR="114300">
+                  <wp:extent cx="5123180" cy="3548380"/>
+                  <wp:effectExtent l="0" t="0" r="7620" b="7620"/>
+                  <wp:docPr id="23" name="图片 2"/>
+                  <wp:cNvGraphicFramePr>
+                    <a:graphicFrameLocks xmlns:a="http://schemas.openxmlformats.org/drawingml/2006/main" noChangeAspect="1"/>
+                  </wp:cNvGraphicFramePr>
+                  <a:graphic xmlns:a="http://schemas.openxmlformats.org/drawingml/2006/main">
+                    <a:graphicData uri="http://schemas.openxmlformats.org/drawingml/2006/picture">
+                      <pic:pic xmlns:pic="http://schemas.openxmlformats.org/drawingml/2006/picture">
+                        <pic:nvPicPr>
+                          <pic:cNvPr id="23" name="图片 2"/>
+                          <pic:cNvPicPr>
+                            <a:picLocks noChangeAspect="1"/>
+                          </pic:cNvPicPr>
+                        </pic:nvPicPr>
+                        <pic:blipFill>
+                          <a:blip r:embed="rId39"/>
+                          <a:stretch>
+                            <a:fillRect/>
+                          </a:stretch>
+                        </pic:blipFill>
+                        <pic:spPr>
+                          <a:xfrm>
+                            <a:off x="0" y="0"/>
+                            <a:ext cx="5123180" cy="3548380"/>
+                          </a:xfrm>
+                          <a:prstGeom prst="rect">
+                            <a:avLst/>
+                          </a:prstGeom>
+                          <a:noFill/>
+                          <a:ln>
+                            <a:noFill/>
+                          </a:ln>
+                        </pic:spPr>
+                      </pic:pic>
+                    </a:graphicData>
+                  </a:graphic>
+                </wp:inline>
+              </w:drawing>
+            </w:r>
           </w:p>
           <w:p>
             <w:pPr>
@@ -8915,7 +9592,7 @@
               <w:rPr>
                 <w:rFonts w:hint="eastAsia"/>
               </w:rPr>
-              <w:t>PPT第26页介绍了Node2Vec节点嵌入算法，注明TuGraph目前从github.com获取子图学习示例，"比较麻烦，需要编译"。</w:t>
+              <w:t>PPT第26页介绍了Node2Vec节点嵌入算法，注明TuGraph目前从github.com获取子图学习示例，</w:t>
             </w:r>
           </w:p>
           <w:p>
@@ -8981,42 +9658,16 @@
               <w:adjustRightInd w:val="0"/>
               <w:jc w:val="left"/>
               <w:rPr>
-                <w:rFonts w:hint="eastAsia"/>
-              </w:rPr>
-            </w:pPr>
-          </w:p>
-          <w:p>
-            <w:pPr>
-              <w:autoSpaceDE w:val="0"/>
-              <w:autoSpaceDN w:val="0"/>
-              <w:adjustRightInd w:val="0"/>
-              <w:jc w:val="left"/>
-              <w:rPr>
-                <w:rFonts w:hint="eastAsia"/>
-              </w:rPr>
-            </w:pPr>
-            <w:r>
-              <w:rPr>
-                <w:rFonts w:hint="eastAsia"/>
-              </w:rPr>
-              <w:t>MATCH (n) RETURN count(n)</w:t>
-            </w:r>
-          </w:p>
-          <w:p>
-            <w:pPr>
-              <w:autoSpaceDE w:val="0"/>
-              <w:autoSpaceDN w:val="0"/>
-              <w:adjustRightInd w:val="0"/>
-              <w:jc w:val="left"/>
-              <w:rPr>
-                <w:rFonts w:hint="eastAsia"/>
-              </w:rPr>
-            </w:pPr>
-            <w:r>
-              <w:rPr>
-                <w:rFonts w:hint="eastAsia"/>
-              </w:rPr>
-              <w:t>MATCH ()-[r]-&gt;() RETURN count(r)</w:t>
+                <w:rFonts w:hint="default" w:eastAsiaTheme="minorEastAsia"/>
+                <w:lang w:val="en-US" w:eastAsia="zh-CN"/>
+              </w:rPr>
+            </w:pPr>
+            <w:r>
+              <w:rPr>
+                <w:rFonts w:hint="eastAsia"/>
+                <w:lang w:val="en-US" w:eastAsia="zh-CN"/>
+              </w:rPr>
+              <w:t>采用图模板</w:t>
             </w:r>
           </w:p>
           <w:p>
@@ -9363,10 +10014,104 @@
               <w:autoSpaceDN w:val="0"/>
               <w:adjustRightInd w:val="0"/>
               <w:jc w:val="left"/>
-              <w:rPr>
-                <w:rFonts w:hint="eastAsia"/>
-              </w:rPr>
-            </w:pPr>
+            </w:pPr>
+            <w:r>
+              <w:drawing>
+                <wp:inline distT="0" distB="0" distL="114300" distR="114300">
+                  <wp:extent cx="5121275" cy="3027680"/>
+                  <wp:effectExtent l="0" t="0" r="9525" b="7620"/>
+                  <wp:docPr id="36" name="图片 3"/>
+                  <wp:cNvGraphicFramePr>
+                    <a:graphicFrameLocks xmlns:a="http://schemas.openxmlformats.org/drawingml/2006/main" noChangeAspect="1"/>
+                  </wp:cNvGraphicFramePr>
+                  <a:graphic xmlns:a="http://schemas.openxmlformats.org/drawingml/2006/main">
+                    <a:graphicData uri="http://schemas.openxmlformats.org/drawingml/2006/picture">
+                      <pic:pic xmlns:pic="http://schemas.openxmlformats.org/drawingml/2006/picture">
+                        <pic:nvPicPr>
+                          <pic:cNvPr id="36" name="图片 3"/>
+                          <pic:cNvPicPr>
+                            <a:picLocks noChangeAspect="1"/>
+                          </pic:cNvPicPr>
+                        </pic:nvPicPr>
+                        <pic:blipFill>
+                          <a:blip r:embed="rId40"/>
+                          <a:stretch>
+                            <a:fillRect/>
+                          </a:stretch>
+                        </pic:blipFill>
+                        <pic:spPr>
+                          <a:xfrm>
+                            <a:off x="0" y="0"/>
+                            <a:ext cx="5121275" cy="3027680"/>
+                          </a:xfrm>
+                          <a:prstGeom prst="rect">
+                            <a:avLst/>
+                          </a:prstGeom>
+                          <a:noFill/>
+                          <a:ln>
+                            <a:noFill/>
+                          </a:ln>
+                        </pic:spPr>
+                      </pic:pic>
+                    </a:graphicData>
+                  </a:graphic>
+                </wp:inline>
+              </w:drawing>
+            </w:r>
+          </w:p>
+          <w:p>
+            <w:pPr>
+              <w:autoSpaceDE w:val="0"/>
+              <w:autoSpaceDN w:val="0"/>
+              <w:adjustRightInd w:val="0"/>
+              <w:jc w:val="left"/>
+              <w:rPr>
+                <w:rFonts w:hint="eastAsia"/>
+              </w:rPr>
+            </w:pPr>
+            <w:r>
+              <w:drawing>
+                <wp:inline distT="0" distB="0" distL="114300" distR="114300">
+                  <wp:extent cx="5120640" cy="2092325"/>
+                  <wp:effectExtent l="0" t="0" r="10160" b="3175"/>
+                  <wp:docPr id="37" name="图片 4"/>
+                  <wp:cNvGraphicFramePr>
+                    <a:graphicFrameLocks xmlns:a="http://schemas.openxmlformats.org/drawingml/2006/main" noChangeAspect="1"/>
+                  </wp:cNvGraphicFramePr>
+                  <a:graphic xmlns:a="http://schemas.openxmlformats.org/drawingml/2006/main">
+                    <a:graphicData uri="http://schemas.openxmlformats.org/drawingml/2006/picture">
+                      <pic:pic xmlns:pic="http://schemas.openxmlformats.org/drawingml/2006/picture">
+                        <pic:nvPicPr>
+                          <pic:cNvPr id="37" name="图片 4"/>
+                          <pic:cNvPicPr>
+                            <a:picLocks noChangeAspect="1"/>
+                          </pic:cNvPicPr>
+                        </pic:nvPicPr>
+                        <pic:blipFill>
+                          <a:blip r:embed="rId41"/>
+                          <a:stretch>
+                            <a:fillRect/>
+                          </a:stretch>
+                        </pic:blipFill>
+                        <pic:spPr>
+                          <a:xfrm>
+                            <a:off x="0" y="0"/>
+                            <a:ext cx="5120640" cy="2092325"/>
+                          </a:xfrm>
+                          <a:prstGeom prst="rect">
+                            <a:avLst/>
+                          </a:prstGeom>
+                          <a:noFill/>
+                          <a:ln>
+                            <a:noFill/>
+                          </a:ln>
+                        </pic:spPr>
+                      </pic:pic>
+                    </a:graphicData>
+                  </a:graphic>
+                </wp:inline>
+              </w:drawing>
+            </w:r>
           </w:p>
           <w:p>
             <w:pPr>
@@ -9434,17 +10179,6 @@
                 <w:rFonts w:hint="eastAsia"/>
               </w:rPr>
             </w:pPr>
-          </w:p>
-          <w:p>
-            <w:pPr>
-              <w:autoSpaceDE w:val="0"/>
-              <w:autoSpaceDN w:val="0"/>
-              <w:adjustRightInd w:val="0"/>
-              <w:jc w:val="left"/>
-              <w:rPr>
-                <w:rFonts w:hint="eastAsia"/>
-              </w:rPr>
-            </w:pPr>
             <w:r>
               <w:rPr>
                 <w:rFonts w:hint="eastAsia"/>
@@ -9936,28 +10670,6 @@
                 <w:rFonts w:hint="eastAsia"/>
               </w:rPr>
             </w:pPr>
-          </w:p>
-          <w:p>
-            <w:pPr>
-              <w:autoSpaceDE w:val="0"/>
-              <w:autoSpaceDN w:val="0"/>
-              <w:adjustRightInd w:val="0"/>
-              <w:jc w:val="left"/>
-              <w:rPr>
-                <w:rFonts w:hint="eastAsia"/>
-              </w:rPr>
-            </w:pPr>
-          </w:p>
-          <w:p>
-            <w:pPr>
-              <w:autoSpaceDE w:val="0"/>
-              <w:autoSpaceDN w:val="0"/>
-              <w:adjustRightInd w:val="0"/>
-              <w:jc w:val="left"/>
-              <w:rPr>
-                <w:rFonts w:hint="eastAsia"/>
-              </w:rPr>
-            </w:pPr>
             <w:r>
               <w:rPr>
                 <w:rFonts w:hint="eastAsia"/>
@@ -10037,17 +10749,6 @@
                 <w:rFonts w:hint="eastAsia"/>
               </w:rPr>
             </w:pPr>
-          </w:p>
-          <w:p>
-            <w:pPr>
-              <w:autoSpaceDE w:val="0"/>
-              <w:autoSpaceDN w:val="0"/>
-              <w:adjustRightInd w:val="0"/>
-              <w:jc w:val="left"/>
-              <w:rPr>
-                <w:rFonts w:hint="eastAsia"/>
-              </w:rPr>
-            </w:pPr>
             <w:r>
               <w:rPr>
                 <w:rFonts w:hint="eastAsia"/>
@@ -10147,6 +10848,202 @@
               <w:jc w:val="left"/>
               <w:rPr>
                 <w:rFonts w:hint="eastAsia"/>
+              </w:rPr>
+            </w:pPr>
+          </w:p>
+          <w:p>
+            <w:pPr>
+              <w:autoSpaceDE w:val="0"/>
+              <w:autoSpaceDN w:val="0"/>
+              <w:adjustRightInd w:val="0"/>
+              <w:jc w:val="left"/>
+              <w:rPr>
+                <w:rFonts w:hint="eastAsia"/>
+              </w:rPr>
+            </w:pPr>
+            <w:r>
+              <w:rPr>
+                <w:rFonts w:hint="eastAsia"/>
+                <w:lang w:val="en-US" w:eastAsia="zh-CN"/>
+              </w:rPr>
+              <w:t>九</w:t>
+            </w:r>
+            <w:r>
+              <w:rPr>
+                <w:rFonts w:hint="eastAsia"/>
+              </w:rPr>
+              <w:t>、链接预测——Common Neighbors（PPT第27页）</w:t>
+            </w:r>
+          </w:p>
+          <w:p>
+            <w:pPr>
+              <w:autoSpaceDE w:val="0"/>
+              <w:autoSpaceDN w:val="0"/>
+              <w:adjustRightInd w:val="0"/>
+              <w:jc w:val="left"/>
+              <w:rPr>
+                <w:rFonts w:hint="eastAsia"/>
+              </w:rPr>
+            </w:pPr>
+            <w:r>
+              <w:rPr>
+                <w:rFonts w:hint="eastAsia"/>
+              </w:rPr>
+              <w:t>PPT第27页介绍链接预测算法，以Tom Hanks为例使用Common Neighbors思想推荐合作演员。</w:t>
+            </w:r>
+          </w:p>
+          <w:p>
+            <w:pPr>
+              <w:autoSpaceDE w:val="0"/>
+              <w:autoSpaceDN w:val="0"/>
+              <w:adjustRightInd w:val="0"/>
+              <w:jc w:val="left"/>
+              <w:rPr>
+                <w:rFonts w:hint="eastAsia"/>
+              </w:rPr>
+            </w:pPr>
+          </w:p>
+          <w:p>
+            <w:pPr>
+              <w:autoSpaceDE w:val="0"/>
+              <w:autoSpaceDN w:val="0"/>
+              <w:adjustRightInd w:val="0"/>
+              <w:jc w:val="left"/>
+              <w:rPr>
+                <w:rFonts w:hint="eastAsia"/>
+                <w:highlight w:val="lightGray"/>
+              </w:rPr>
+            </w:pPr>
+            <w:r>
+              <w:rPr>
+                <w:rFonts w:hint="eastAsia"/>
+              </w:rPr>
+              <w:t>1. 执行合作演员推荐查询</w:t>
+            </w:r>
+          </w:p>
+          <w:p>
+            <w:pPr>
+              <w:autoSpaceDE w:val="0"/>
+              <w:autoSpaceDN w:val="0"/>
+              <w:adjustRightInd w:val="0"/>
+              <w:jc w:val="left"/>
+              <w:rPr>
+                <w:rFonts w:hint="eastAsia"/>
+                <w:highlight w:val="lightGray"/>
+              </w:rPr>
+            </w:pPr>
+            <w:r>
+              <w:rPr>
+                <w:rFonts w:hint="eastAsia"/>
+                <w:highlight w:val="lightGray"/>
+              </w:rPr>
+              <w:t>MATCH (tom:person {name: 'Tom Hanks'})-[:acted_in]-&gt;(m:movie)&lt;-[:acted_in]-(coActors:person),</w:t>
+            </w:r>
+          </w:p>
+          <w:p>
+            <w:pPr>
+              <w:autoSpaceDE w:val="0"/>
+              <w:autoSpaceDN w:val="0"/>
+              <w:adjustRightInd w:val="0"/>
+              <w:jc w:val="left"/>
+              <w:rPr>
+                <w:rFonts w:hint="eastAsia"/>
+                <w:highlight w:val="lightGray"/>
+              </w:rPr>
+            </w:pPr>
+            <w:r>
+              <w:rPr>
+                <w:rFonts w:hint="eastAsia"/>
+                <w:highlight w:val="lightGray"/>
+              </w:rPr>
+              <w:t xml:space="preserve">      (coActors)-[:acted_in]-&gt;(m2:movie)&lt;-[:acted_in]-(cocoActors:person)</w:t>
+            </w:r>
+          </w:p>
+          <w:p>
+            <w:pPr>
+              <w:autoSpaceDE w:val="0"/>
+              <w:autoSpaceDN w:val="0"/>
+              <w:adjustRightInd w:val="0"/>
+              <w:jc w:val="left"/>
+              <w:rPr>
+                <w:rFonts w:hint="eastAsia"/>
+                <w:highlight w:val="lightGray"/>
+              </w:rPr>
+            </w:pPr>
+            <w:r>
+              <w:rPr>
+                <w:rFonts w:hint="eastAsia"/>
+                <w:highlight w:val="lightGray"/>
+              </w:rPr>
+              <w:t>WHERE NOT (tom)-[:acted_in]-&gt;()&lt;-[:acted_in]-(cocoActors)</w:t>
+            </w:r>
+          </w:p>
+          <w:p>
+            <w:pPr>
+              <w:autoSpaceDE w:val="0"/>
+              <w:autoSpaceDN w:val="0"/>
+              <w:adjustRightInd w:val="0"/>
+              <w:jc w:val="left"/>
+              <w:rPr>
+                <w:rFonts w:hint="eastAsia"/>
+                <w:highlight w:val="lightGray"/>
+              </w:rPr>
+            </w:pPr>
+            <w:r>
+              <w:rPr>
+                <w:rFonts w:hint="eastAsia"/>
+                <w:highlight w:val="lightGray"/>
+              </w:rPr>
+              <w:t xml:space="preserve">  AND tom &lt;&gt; cocoActors</w:t>
+            </w:r>
+          </w:p>
+          <w:p>
+            <w:pPr>
+              <w:autoSpaceDE w:val="0"/>
+              <w:autoSpaceDN w:val="0"/>
+              <w:adjustRightInd w:val="0"/>
+              <w:jc w:val="left"/>
+              <w:rPr>
+                <w:rFonts w:hint="eastAsia"/>
+                <w:highlight w:val="lightGray"/>
+              </w:rPr>
+            </w:pPr>
+            <w:r>
+              <w:rPr>
+                <w:rFonts w:hint="eastAsia"/>
+                <w:highlight w:val="lightGray"/>
+              </w:rPr>
+              <w:t>RETURN cocoActors.name AS Recommended, COUNT(*) AS Strength</w:t>
+            </w:r>
+          </w:p>
+          <w:p>
+            <w:pPr>
+              <w:autoSpaceDE w:val="0"/>
+              <w:autoSpaceDN w:val="0"/>
+              <w:adjustRightInd w:val="0"/>
+              <w:jc w:val="left"/>
+              <w:rPr>
+                <w:rFonts w:hint="eastAsia"/>
+                <w:highlight w:val="lightGray"/>
+              </w:rPr>
+            </w:pPr>
+            <w:r>
+              <w:rPr>
+                <w:rFonts w:hint="eastAsia"/>
+                <w:highlight w:val="lightGray"/>
+              </w:rPr>
+              <w:t>ORDER BY Strength DESC</w:t>
+            </w:r>
+          </w:p>
+          <w:p>
+            <w:pPr>
+              <w:autoSpaceDE w:val="0"/>
+              <w:autoSpaceDN w:val="0"/>
+              <w:adjustRightInd w:val="0"/>
+              <w:jc w:val="left"/>
+              <w:rPr>
+                <w:rFonts w:hint="eastAsia"/>
+                <w:highlight w:val="lightGray"/>
               </w:rPr>
             </w:pPr>
             <w:bookmarkStart w:id="0" w:name="_GoBack"/>
@@ -10165,212 +11062,6 @@
             <w:r>
               <w:rPr>
                 <w:rFonts w:hint="eastAsia"/>
-                <w:lang w:val="en-US" w:eastAsia="zh-CN"/>
-              </w:rPr>
-              <w:t>九</w:t>
-            </w:r>
-            <w:r>
-              <w:rPr>
-                <w:rFonts w:hint="eastAsia"/>
-              </w:rPr>
-              <w:t>、链接预测——Common Neighbors（PPT第27页）</w:t>
-            </w:r>
-          </w:p>
-          <w:p>
-            <w:pPr>
-              <w:autoSpaceDE w:val="0"/>
-              <w:autoSpaceDN w:val="0"/>
-              <w:adjustRightInd w:val="0"/>
-              <w:jc w:val="left"/>
-              <w:rPr>
-                <w:rFonts w:hint="eastAsia"/>
-              </w:rPr>
-            </w:pPr>
-            <w:r>
-              <w:rPr>
-                <w:rFonts w:hint="eastAsia"/>
-              </w:rPr>
-              <w:t>PPT第27页介绍链接预测算法，以Tom Hanks为例使用Common Neighbors思想推荐合作演员。</w:t>
-            </w:r>
-          </w:p>
-          <w:p>
-            <w:pPr>
-              <w:autoSpaceDE w:val="0"/>
-              <w:autoSpaceDN w:val="0"/>
-              <w:adjustRightInd w:val="0"/>
-              <w:jc w:val="left"/>
-              <w:rPr>
-                <w:rFonts w:hint="eastAsia"/>
-              </w:rPr>
-            </w:pPr>
-          </w:p>
-          <w:p>
-            <w:pPr>
-              <w:autoSpaceDE w:val="0"/>
-              <w:autoSpaceDN w:val="0"/>
-              <w:adjustRightInd w:val="0"/>
-              <w:jc w:val="left"/>
-              <w:rPr>
-                <w:rFonts w:hint="eastAsia"/>
-              </w:rPr>
-            </w:pPr>
-            <w:r>
-              <w:rPr>
-                <w:rFonts w:hint="eastAsia"/>
-              </w:rPr>
-              <w:t>1. 执行合作演员推荐查询</w:t>
-            </w:r>
-          </w:p>
-          <w:p>
-            <w:pPr>
-              <w:autoSpaceDE w:val="0"/>
-              <w:autoSpaceDN w:val="0"/>
-              <w:adjustRightInd w:val="0"/>
-              <w:jc w:val="left"/>
-              <w:rPr>
-                <w:rFonts w:hint="eastAsia"/>
-              </w:rPr>
-            </w:pPr>
-          </w:p>
-          <w:p>
-            <w:pPr>
-              <w:autoSpaceDE w:val="0"/>
-              <w:autoSpaceDN w:val="0"/>
-              <w:adjustRightInd w:val="0"/>
-              <w:jc w:val="left"/>
-              <w:rPr>
-                <w:rFonts w:hint="eastAsia"/>
-                <w:highlight w:val="lightGray"/>
-              </w:rPr>
-            </w:pPr>
-          </w:p>
-          <w:p>
-            <w:pPr>
-              <w:autoSpaceDE w:val="0"/>
-              <w:autoSpaceDN w:val="0"/>
-              <w:adjustRightInd w:val="0"/>
-              <w:jc w:val="left"/>
-              <w:rPr>
-                <w:rFonts w:hint="eastAsia"/>
-                <w:highlight w:val="lightGray"/>
-              </w:rPr>
-            </w:pPr>
-            <w:r>
-              <w:rPr>
-                <w:rFonts w:hint="eastAsia"/>
-                <w:highlight w:val="lightGray"/>
-              </w:rPr>
-              <w:t>MATCH (tom:person {name: 'Tom Hanks'})-[:acted_in]-&gt;(m:movie)&lt;-[:acted_in]-(coActors:person),</w:t>
-            </w:r>
-          </w:p>
-          <w:p>
-            <w:pPr>
-              <w:autoSpaceDE w:val="0"/>
-              <w:autoSpaceDN w:val="0"/>
-              <w:adjustRightInd w:val="0"/>
-              <w:jc w:val="left"/>
-              <w:rPr>
-                <w:rFonts w:hint="eastAsia"/>
-                <w:highlight w:val="lightGray"/>
-              </w:rPr>
-            </w:pPr>
-            <w:r>
-              <w:rPr>
-                <w:rFonts w:hint="eastAsia"/>
-                <w:highlight w:val="lightGray"/>
-              </w:rPr>
-              <w:t xml:space="preserve">      (coActors)-[:acted_in]-&gt;(m2:movie)&lt;-[:acted_in]-(cocoActors:person)</w:t>
-            </w:r>
-          </w:p>
-          <w:p>
-            <w:pPr>
-              <w:autoSpaceDE w:val="0"/>
-              <w:autoSpaceDN w:val="0"/>
-              <w:adjustRightInd w:val="0"/>
-              <w:jc w:val="left"/>
-              <w:rPr>
-                <w:rFonts w:hint="eastAsia"/>
-                <w:highlight w:val="lightGray"/>
-              </w:rPr>
-            </w:pPr>
-            <w:r>
-              <w:rPr>
-                <w:rFonts w:hint="eastAsia"/>
-                <w:highlight w:val="lightGray"/>
-              </w:rPr>
-              <w:t>WHERE NOT (tom)-[:acted_in]-&gt;()&lt;-[:acted_in]-(cocoActors)</w:t>
-            </w:r>
-          </w:p>
-          <w:p>
-            <w:pPr>
-              <w:autoSpaceDE w:val="0"/>
-              <w:autoSpaceDN w:val="0"/>
-              <w:adjustRightInd w:val="0"/>
-              <w:jc w:val="left"/>
-              <w:rPr>
-                <w:rFonts w:hint="eastAsia"/>
-                <w:highlight w:val="lightGray"/>
-              </w:rPr>
-            </w:pPr>
-            <w:r>
-              <w:rPr>
-                <w:rFonts w:hint="eastAsia"/>
-                <w:highlight w:val="lightGray"/>
-              </w:rPr>
-              <w:t xml:space="preserve">  AND tom &lt;&gt; cocoActors</w:t>
-            </w:r>
-          </w:p>
-          <w:p>
-            <w:pPr>
-              <w:autoSpaceDE w:val="0"/>
-              <w:autoSpaceDN w:val="0"/>
-              <w:adjustRightInd w:val="0"/>
-              <w:jc w:val="left"/>
-              <w:rPr>
-                <w:rFonts w:hint="eastAsia"/>
-                <w:highlight w:val="lightGray"/>
-              </w:rPr>
-            </w:pPr>
-            <w:r>
-              <w:rPr>
-                <w:rFonts w:hint="eastAsia"/>
-                <w:highlight w:val="lightGray"/>
-              </w:rPr>
-              <w:t>RETURN cocoActors.name AS Recommended, COUNT(*) AS Strength</w:t>
-            </w:r>
-          </w:p>
-          <w:p>
-            <w:pPr>
-              <w:autoSpaceDE w:val="0"/>
-              <w:autoSpaceDN w:val="0"/>
-              <w:adjustRightInd w:val="0"/>
-              <w:jc w:val="left"/>
-              <w:rPr>
-                <w:rFonts w:hint="eastAsia"/>
-                <w:highlight w:val="lightGray"/>
-              </w:rPr>
-            </w:pPr>
-            <w:r>
-              <w:rPr>
-                <w:rFonts w:hint="eastAsia"/>
-                <w:highlight w:val="lightGray"/>
-              </w:rPr>
-              <w:t>ORDER BY Strength DESC</w:t>
-            </w:r>
-          </w:p>
-          <w:p>
-            <w:pPr>
-              <w:autoSpaceDE w:val="0"/>
-              <w:autoSpaceDN w:val="0"/>
-              <w:adjustRightInd w:val="0"/>
-              <w:jc w:val="left"/>
-              <w:rPr>
-                <w:rFonts w:hint="eastAsia"/>
-              </w:rPr>
-            </w:pPr>
-            <w:r>
-              <w:rPr>
-                <w:rFonts w:hint="eastAsia"/>
               </w:rPr>
               <w:t>2. 查询逻辑解释</w:t>
             </w:r>
@@ -10604,28 +11295,6 @@
               </w:rPr>
               <w:t>3. 简化版Common Neighbors查询</w:t>
             </w:r>
-          </w:p>
-          <w:p>
-            <w:pPr>
-              <w:autoSpaceDE w:val="0"/>
-              <w:autoSpaceDN w:val="0"/>
-              <w:adjustRightInd w:val="0"/>
-              <w:jc w:val="left"/>
-              <w:rPr>
-                <w:rFonts w:hint="eastAsia"/>
-              </w:rPr>
-            </w:pPr>
-          </w:p>
-          <w:p>
-            <w:pPr>
-              <w:autoSpaceDE w:val="0"/>
-              <w:autoSpaceDN w:val="0"/>
-              <w:adjustRightInd w:val="0"/>
-              <w:jc w:val="left"/>
-              <w:rPr>
-                <w:rFonts w:hint="eastAsia"/>
-              </w:rPr>
-            </w:pPr>
           </w:p>
           <w:p>
             <w:pPr>

</xml_diff>